<commit_message>
Update Langflow beginner guide
</commit_message>
<xml_diff>
--- a/Langflow_Beginner_Guide.docx
+++ b/Langflow_Beginner_Guide.docx
@@ -56,6 +56,7 @@
       <w:tr>
         <w:trPr>
           <w:tblHeader w:val="true"/>
+          <w:cantSplit w:val="true"/>
         </w:trPr>
         <w:tc>
           <w:tcPr>
@@ -109,6 +110,9 @@
         </w:tc>
       </w:tr>
       <w:tr>
+        <w:trPr>
+          <w:cantSplit w:val="true"/>
+        </w:trPr>
         <w:tc>
           <w:tcPr>
             <w:tcW w:type="dxa" w:w="3528"/>
@@ -151,6 +155,9 @@
         </w:tc>
       </w:tr>
       <w:tr>
+        <w:trPr>
+          <w:cantSplit w:val="true"/>
+        </w:trPr>
         <w:tc>
           <w:tcPr>
             <w:tcW w:type="dxa" w:w="3528"/>
@@ -195,6 +202,9 @@
         </w:tc>
       </w:tr>
       <w:tr>
+        <w:trPr>
+          <w:cantSplit w:val="true"/>
+        </w:trPr>
         <w:tc>
           <w:tcPr>
             <w:tcW w:type="dxa" w:w="3528"/>
@@ -400,45 +410,80 @@
     </w:p>
     <w:p>
       <w:pPr>
-        <w:pStyle w:val="ListNumber"/>
+        <w:spacing w:after="60"/>
+        <w:ind w:left="403" w:hanging="288"/>
         <w:widowControl w:val="1"/>
       </w:pPr>
+      <w:r>
+        <w:rPr>
+          <w:b/>
+        </w:rPr>
+        <w:t xml:space="preserve">1. </w:t>
+      </w:r>
       <w:r>
         <w:t>Open Langflow and enter a project.</w:t>
       </w:r>
     </w:p>
     <w:p>
       <w:pPr>
-        <w:pStyle w:val="ListNumber"/>
+        <w:spacing w:after="60"/>
+        <w:ind w:left="403" w:hanging="288"/>
         <w:widowControl w:val="1"/>
       </w:pPr>
+      <w:r>
+        <w:rPr>
+          <w:b/>
+        </w:rPr>
+        <w:t xml:space="preserve">2. </w:t>
+      </w:r>
       <w:r>
         <w:t>Create a flow from a template, or import one of the JSON files in this repository.</w:t>
       </w:r>
     </w:p>
     <w:p>
       <w:pPr>
-        <w:pStyle w:val="ListNumber"/>
+        <w:spacing w:after="60"/>
+        <w:ind w:left="403" w:hanging="288"/>
         <w:widowControl w:val="1"/>
       </w:pPr>
+      <w:r>
+        <w:rPr>
+          <w:b/>
+        </w:rPr>
+        <w:t xml:space="preserve">3. </w:t>
+      </w:r>
       <w:r>
         <w:t>Configure the model, credentials, and required component fields.</w:t>
       </w:r>
     </w:p>
     <w:p>
       <w:pPr>
-        <w:pStyle w:val="ListNumber"/>
+        <w:spacing w:after="60"/>
+        <w:ind w:left="403" w:hanging="288"/>
         <w:widowControl w:val="1"/>
       </w:pPr>
+      <w:r>
+        <w:rPr>
+          <w:b/>
+        </w:rPr>
+        <w:t xml:space="preserve">4. </w:t>
+      </w:r>
       <w:r>
         <w:t>Run individual components, then test the complete flow in the Playground when the flow supports chat.</w:t>
       </w:r>
     </w:p>
     <w:p>
       <w:pPr>
-        <w:pStyle w:val="ListNumber"/>
+        <w:spacing w:after="60"/>
+        <w:ind w:left="403" w:hanging="288"/>
         <w:widowControl w:val="1"/>
       </w:pPr>
+      <w:r>
+        <w:rPr>
+          <w:b/>
+        </w:rPr>
+        <w:t xml:space="preserve">5. </w:t>
+      </w:r>
       <w:r>
         <w:t>Read the output and logs, correct any errors, and export a known-good copy.</w:t>
       </w:r>
@@ -502,6 +547,7 @@
       <w:tr>
         <w:trPr>
           <w:tblHeader w:val="true"/>
+          <w:cantSplit w:val="true"/>
         </w:trPr>
         <w:tc>
           <w:tcPr>
@@ -580,6 +626,9 @@
         </w:tc>
       </w:tr>
       <w:tr>
+        <w:trPr>
+          <w:cantSplit w:val="true"/>
+        </w:trPr>
         <w:tc>
           <w:tcPr>
             <w:tcW w:type="dxa" w:w="1440"/>
@@ -642,6 +691,9 @@
         </w:tc>
       </w:tr>
       <w:tr>
+        <w:trPr>
+          <w:cantSplit w:val="true"/>
+        </w:trPr>
         <w:tc>
           <w:tcPr>
             <w:tcW w:type="dxa" w:w="1440"/>
@@ -707,6 +759,9 @@
         </w:tc>
       </w:tr>
       <w:tr>
+        <w:trPr>
+          <w:cantSplit w:val="true"/>
+        </w:trPr>
         <w:tc>
           <w:tcPr>
             <w:tcW w:type="dxa" w:w="1440"/>
@@ -769,6 +824,9 @@
         </w:tc>
       </w:tr>
       <w:tr>
+        <w:trPr>
+          <w:cantSplit w:val="true"/>
+        </w:trPr>
         <w:tc>
           <w:tcPr>
             <w:tcW w:type="dxa" w:w="1440"/>
@@ -834,6 +892,9 @@
         </w:tc>
       </w:tr>
       <w:tr>
+        <w:trPr>
+          <w:cantSplit w:val="true"/>
+        </w:trPr>
         <w:tc>
           <w:tcPr>
             <w:tcW w:type="dxa" w:w="1440"/>
@@ -1105,6 +1166,7 @@
       <w:tr>
         <w:trPr>
           <w:tblHeader w:val="true"/>
+          <w:cantSplit w:val="true"/>
         </w:trPr>
         <w:tc>
           <w:tcPr>
@@ -1183,6 +1245,9 @@
         </w:tc>
       </w:tr>
       <w:tr>
+        <w:trPr>
+          <w:cantSplit w:val="true"/>
+        </w:trPr>
         <w:tc>
           <w:tcPr>
             <w:tcW w:type="dxa" w:w="2016"/>
@@ -1245,6 +1310,9 @@
         </w:tc>
       </w:tr>
       <w:tr>
+        <w:trPr>
+          <w:cantSplit w:val="true"/>
+        </w:trPr>
         <w:tc>
           <w:tcPr>
             <w:tcW w:type="dxa" w:w="2016"/>
@@ -1310,6 +1378,9 @@
         </w:tc>
       </w:tr>
       <w:tr>
+        <w:trPr>
+          <w:cantSplit w:val="true"/>
+        </w:trPr>
         <w:tc>
           <w:tcPr>
             <w:tcW w:type="dxa" w:w="2016"/>
@@ -1372,6 +1443,9 @@
         </w:tc>
       </w:tr>
       <w:tr>
+        <w:trPr>
+          <w:cantSplit w:val="true"/>
+        </w:trPr>
         <w:tc>
           <w:tcPr>
             <w:tcW w:type="dxa" w:w="2016"/>
@@ -1437,6 +1511,9 @@
         </w:tc>
       </w:tr>
       <w:tr>
+        <w:trPr>
+          <w:cantSplit w:val="true"/>
+        </w:trPr>
         <w:tc>
           <w:tcPr>
             <w:tcW w:type="dxa" w:w="2016"/>
@@ -1499,6 +1576,9 @@
         </w:tc>
       </w:tr>
       <w:tr>
+        <w:trPr>
+          <w:cantSplit w:val="true"/>
+        </w:trPr>
         <w:tc>
           <w:tcPr>
             <w:tcW w:type="dxa" w:w="2016"/>
@@ -1564,6 +1644,9 @@
         </w:tc>
       </w:tr>
       <w:tr>
+        <w:trPr>
+          <w:cantSplit w:val="true"/>
+        </w:trPr>
         <w:tc>
           <w:tcPr>
             <w:tcW w:type="dxa" w:w="2016"/>
@@ -1626,6 +1709,9 @@
         </w:tc>
       </w:tr>
       <w:tr>
+        <w:trPr>
+          <w:cantSplit w:val="true"/>
+        </w:trPr>
         <w:tc>
           <w:tcPr>
             <w:tcW w:type="dxa" w:w="2016"/>
@@ -1737,45 +1823,80 @@
     </w:p>
     <w:p>
       <w:pPr>
-        <w:pStyle w:val="ListNumber"/>
+        <w:spacing w:after="60"/>
+        <w:ind w:left="403" w:hanging="288"/>
         <w:widowControl w:val="1"/>
       </w:pPr>
+      <w:r>
+        <w:rPr>
+          <w:b/>
+        </w:rPr>
+        <w:t xml:space="preserve">1. </w:t>
+      </w:r>
       <w:r>
         <w:t>Open a project and select New Flow.</w:t>
       </w:r>
     </w:p>
     <w:p>
       <w:pPr>
-        <w:pStyle w:val="ListNumber"/>
+        <w:spacing w:after="60"/>
+        <w:ind w:left="403" w:hanging="288"/>
         <w:widowControl w:val="1"/>
       </w:pPr>
+      <w:r>
+        <w:rPr>
+          <w:b/>
+        </w:rPr>
+        <w:t xml:space="preserve">2. </w:t>
+      </w:r>
       <w:r>
         <w:t>Choose a starter template. Basic Prompting is a useful first example when it is available.</w:t>
       </w:r>
     </w:p>
     <w:p>
       <w:pPr>
-        <w:pStyle w:val="ListNumber"/>
+        <w:spacing w:after="60"/>
+        <w:ind w:left="403" w:hanging="288"/>
         <w:widowControl w:val="1"/>
       </w:pPr>
+      <w:r>
+        <w:rPr>
+          <w:b/>
+        </w:rPr>
+        <w:t xml:space="preserve">3. </w:t>
+      </w:r>
       <w:r>
         <w:t>Inspect each component from left to right before changing anything.</w:t>
       </w:r>
     </w:p>
     <w:p>
       <w:pPr>
-        <w:pStyle w:val="ListNumber"/>
+        <w:spacing w:after="60"/>
+        <w:ind w:left="403" w:hanging="288"/>
         <w:widowControl w:val="1"/>
       </w:pPr>
+      <w:r>
+        <w:rPr>
+          <w:b/>
+        </w:rPr>
+        <w:t xml:space="preserve">4. </w:t>
+      </w:r>
       <w:r>
         <w:t>Configure the language model provider, model, and credentials.</w:t>
       </w:r>
     </w:p>
     <w:p>
       <w:pPr>
-        <w:pStyle w:val="ListNumber"/>
+        <w:spacing w:after="60"/>
+        <w:ind w:left="403" w:hanging="288"/>
         <w:widowControl w:val="1"/>
       </w:pPr>
+      <w:r>
+        <w:rPr>
+          <w:b/>
+        </w:rPr>
+        <w:t xml:space="preserve">5. </w:t>
+      </w:r>
       <w:r>
         <w:t>Open the Playground and send a simple test message.</w:t>
       </w:r>
@@ -1809,63 +1930,112 @@
     </w:p>
     <w:p>
       <w:pPr>
-        <w:pStyle w:val="ListNumber"/>
+        <w:spacing w:after="60"/>
+        <w:ind w:left="403" w:hanging="288"/>
         <w:widowControl w:val="1"/>
       </w:pPr>
+      <w:r>
+        <w:rPr>
+          <w:b/>
+        </w:rPr>
+        <w:t xml:space="preserve">1. </w:t>
+      </w:r>
       <w:r>
         <w:t>Create a blank flow.</w:t>
       </w:r>
     </w:p>
     <w:p>
       <w:pPr>
-        <w:pStyle w:val="ListNumber"/>
+        <w:spacing w:after="60"/>
+        <w:ind w:left="403" w:hanging="288"/>
         <w:widowControl w:val="1"/>
       </w:pPr>
+      <w:r>
+        <w:rPr>
+          <w:b/>
+        </w:rPr>
+        <w:t xml:space="preserve">2. </w:t>
+      </w:r>
       <w:r>
         <w:t>Drag Chat Input, Prompt, a Language Model, and Chat Output onto the canvas.</w:t>
       </w:r>
     </w:p>
     <w:p>
       <w:pPr>
-        <w:pStyle w:val="ListNumber"/>
+        <w:spacing w:after="60"/>
+        <w:ind w:left="403" w:hanging="288"/>
         <w:widowControl w:val="1"/>
       </w:pPr>
+      <w:r>
+        <w:rPr>
+          <w:b/>
+        </w:rPr>
+        <w:t xml:space="preserve">3. </w:t>
+      </w:r>
       <w:r>
         <w:t>Connect Chat Input to the text or input field of the Prompt component.</w:t>
       </w:r>
     </w:p>
     <w:p>
       <w:pPr>
-        <w:pStyle w:val="ListNumber"/>
+        <w:spacing w:after="60"/>
+        <w:ind w:left="403" w:hanging="288"/>
         <w:widowControl w:val="1"/>
       </w:pPr>
+      <w:r>
+        <w:rPr>
+          <w:b/>
+        </w:rPr>
+        <w:t xml:space="preserve">4. </w:t>
+      </w:r>
       <w:r>
         <w:t>Connect the Prompt output to the Language Model input.</w:t>
       </w:r>
     </w:p>
     <w:p>
       <w:pPr>
-        <w:pStyle w:val="ListNumber"/>
+        <w:spacing w:after="60"/>
+        <w:ind w:left="403" w:hanging="288"/>
         <w:widowControl w:val="1"/>
       </w:pPr>
+      <w:r>
+        <w:rPr>
+          <w:b/>
+        </w:rPr>
+        <w:t xml:space="preserve">5. </w:t>
+      </w:r>
       <w:r>
         <w:t>Connect the model response to Chat Output.</w:t>
       </w:r>
     </w:p>
     <w:p>
       <w:pPr>
-        <w:pStyle w:val="ListNumber"/>
+        <w:spacing w:after="60"/>
+        <w:ind w:left="403" w:hanging="288"/>
         <w:widowControl w:val="1"/>
       </w:pPr>
+      <w:r>
+        <w:rPr>
+          <w:b/>
+        </w:rPr>
+        <w:t xml:space="preserve">6. </w:t>
+      </w:r>
       <w:r>
         <w:t>In the Prompt component, add a clear instruction and preserve the variable connected from Chat Input.</w:t>
       </w:r>
     </w:p>
     <w:p>
       <w:pPr>
-        <w:pStyle w:val="ListNumber"/>
+        <w:spacing w:after="60"/>
+        <w:ind w:left="403" w:hanging="288"/>
         <w:widowControl w:val="1"/>
       </w:pPr>
+      <w:r>
+        <w:rPr>
+          <w:b/>
+        </w:rPr>
+        <w:t xml:space="preserve">7. </w:t>
+      </w:r>
       <w:r>
         <w:t>Configure the model, then test the flow in the Playground.</w:t>
       </w:r>
@@ -1917,54 +2087,96 @@
     </w:p>
     <w:p>
       <w:pPr>
-        <w:pStyle w:val="ListNumber"/>
+        <w:spacing w:after="60"/>
+        <w:ind w:left="403" w:hanging="288"/>
         <w:widowControl w:val="1"/>
       </w:pPr>
+      <w:r>
+        <w:rPr>
+          <w:b/>
+        </w:rPr>
+        <w:t xml:space="preserve">1. </w:t>
+      </w:r>
       <w:r>
         <w:t>Open the target project.</w:t>
       </w:r>
     </w:p>
     <w:p>
       <w:pPr>
-        <w:pStyle w:val="ListNumber"/>
+        <w:spacing w:after="60"/>
+        <w:ind w:left="403" w:hanging="288"/>
         <w:widowControl w:val="1"/>
       </w:pPr>
+      <w:r>
+        <w:rPr>
+          <w:b/>
+        </w:rPr>
+        <w:t xml:space="preserve">2. </w:t>
+      </w:r>
       <w:r>
         <w:t>Choose Upload flow or Import. The exact label depends on the version.</w:t>
       </w:r>
     </w:p>
     <w:p>
       <w:pPr>
-        <w:pStyle w:val="ListNumber"/>
+        <w:spacing w:after="60"/>
+        <w:ind w:left="403" w:hanging="288"/>
         <w:widowControl w:val="1"/>
       </w:pPr>
+      <w:r>
+        <w:rPr>
+          <w:b/>
+        </w:rPr>
+        <w:t xml:space="preserve">3. </w:t>
+      </w:r>
       <w:r>
         <w:t>Select the exported JSON file.</w:t>
       </w:r>
     </w:p>
     <w:p>
       <w:pPr>
-        <w:pStyle w:val="ListNumber"/>
+        <w:spacing w:after="60"/>
+        <w:ind w:left="403" w:hanging="288"/>
         <w:widowControl w:val="1"/>
       </w:pPr>
+      <w:r>
+        <w:rPr>
+          <w:b/>
+        </w:rPr>
+        <w:t xml:space="preserve">4. </w:t>
+      </w:r>
       <w:r>
         <w:t>Open the imported flow and inspect every component that displays a warning or missing value.</w:t>
       </w:r>
     </w:p>
     <w:p>
       <w:pPr>
-        <w:pStyle w:val="ListNumber"/>
+        <w:spacing w:after="60"/>
+        <w:ind w:left="403" w:hanging="288"/>
         <w:widowControl w:val="1"/>
       </w:pPr>
+      <w:r>
+        <w:rPr>
+          <w:b/>
+        </w:rPr>
+        <w:t xml:space="preserve">5. </w:t>
+      </w:r>
       <w:r>
         <w:t>Replace unavailable model providers or components with equivalents installed on your server.</w:t>
       </w:r>
     </w:p>
     <w:p>
       <w:pPr>
-        <w:pStyle w:val="ListNumber"/>
+        <w:spacing w:after="60"/>
+        <w:ind w:left="403" w:hanging="288"/>
         <w:widowControl w:val="1"/>
       </w:pPr>
+      <w:r>
+        <w:rPr>
+          <w:b/>
+        </w:rPr>
+        <w:t xml:space="preserve">6. </w:t>
+      </w:r>
       <w:r>
         <w:t>Configure credentials and run a small test before using real workloads.</w:t>
       </w:r>
@@ -2091,6 +2303,7 @@
       <w:tr>
         <w:trPr>
           <w:tblHeader w:val="true"/>
+          <w:cantSplit w:val="true"/>
         </w:trPr>
         <w:tc>
           <w:tcPr>
@@ -2169,6 +2382,9 @@
         </w:tc>
       </w:tr>
       <w:tr>
+        <w:trPr>
+          <w:cantSplit w:val="true"/>
+        </w:trPr>
         <w:tc>
           <w:tcPr>
             <w:tcW w:type="dxa" w:w="2088"/>
@@ -2231,6 +2447,9 @@
         </w:tc>
       </w:tr>
       <w:tr>
+        <w:trPr>
+          <w:cantSplit w:val="true"/>
+        </w:trPr>
         <w:tc>
           <w:tcPr>
             <w:tcW w:type="dxa" w:w="2088"/>
@@ -2296,6 +2515,9 @@
         </w:tc>
       </w:tr>
       <w:tr>
+        <w:trPr>
+          <w:cantSplit w:val="true"/>
+        </w:trPr>
         <w:tc>
           <w:tcPr>
             <w:tcW w:type="dxa" w:w="2088"/>
@@ -2358,6 +2580,9 @@
         </w:tc>
       </w:tr>
       <w:tr>
+        <w:trPr>
+          <w:cantSplit w:val="true"/>
+        </w:trPr>
         <w:tc>
           <w:tcPr>
             <w:tcW w:type="dxa" w:w="2088"/>
@@ -2505,54 +2730,96 @@
     </w:p>
     <w:p>
       <w:pPr>
-        <w:pStyle w:val="ListNumber"/>
+        <w:spacing w:after="60"/>
+        <w:ind w:left="403" w:hanging="288"/>
         <w:widowControl w:val="1"/>
       </w:pPr>
+      <w:r>
+        <w:rPr>
+          <w:b/>
+        </w:rPr>
+        <w:t xml:space="preserve">1. </w:t>
+      </w:r>
       <w:r>
         <w:t>Run with the smallest useful input.</w:t>
       </w:r>
     </w:p>
     <w:p>
       <w:pPr>
-        <w:pStyle w:val="ListNumber"/>
+        <w:spacing w:after="60"/>
+        <w:ind w:left="403" w:hanging="288"/>
         <w:widowControl w:val="1"/>
       </w:pPr>
+      <w:r>
+        <w:rPr>
+          <w:b/>
+        </w:rPr>
+        <w:t xml:space="preserve">2. </w:t>
+      </w:r>
       <w:r>
         <w:t>Confirm that the expected components execute.</w:t>
       </w:r>
     </w:p>
     <w:p>
       <w:pPr>
-        <w:pStyle w:val="ListNumber"/>
+        <w:spacing w:after="60"/>
+        <w:ind w:left="403" w:hanging="288"/>
         <w:widowControl w:val="1"/>
       </w:pPr>
+      <w:r>
+        <w:rPr>
+          <w:b/>
+        </w:rPr>
+        <w:t xml:space="preserve">3. </w:t>
+      </w:r>
       <w:r>
         <w:t>Inspect intermediate outputs and logs.</w:t>
       </w:r>
     </w:p>
     <w:p>
       <w:pPr>
-        <w:pStyle w:val="ListNumber"/>
+        <w:spacing w:after="60"/>
+        <w:ind w:left="403" w:hanging="288"/>
         <w:widowControl w:val="1"/>
       </w:pPr>
+      <w:r>
+        <w:rPr>
+          <w:b/>
+        </w:rPr>
+        <w:t xml:space="preserve">4. </w:t>
+      </w:r>
       <w:r>
         <w:t>Test an empty, malformed, or unexpected input.</w:t>
       </w:r>
     </w:p>
     <w:p>
       <w:pPr>
-        <w:pStyle w:val="ListNumber"/>
+        <w:spacing w:after="60"/>
+        <w:ind w:left="403" w:hanging="288"/>
         <w:widowControl w:val="1"/>
       </w:pPr>
+      <w:r>
+        <w:rPr>
+          <w:b/>
+        </w:rPr>
+        <w:t xml:space="preserve">5. </w:t>
+      </w:r>
       <w:r>
         <w:t>Test one realistic input using approved data.</w:t>
       </w:r>
     </w:p>
     <w:p>
       <w:pPr>
-        <w:pStyle w:val="ListNumber"/>
+        <w:spacing w:after="60"/>
+        <w:ind w:left="403" w:hanging="288"/>
         <w:widowControl w:val="1"/>
       </w:pPr>
+      <w:r>
+        <w:rPr>
+          <w:b/>
+        </w:rPr>
+        <w:t xml:space="preserve">6. </w:t>
+      </w:r>
       <w:r>
         <w:t>Save or export the flow after the test succeeds.</w:t>
       </w:r>
@@ -2651,54 +2918,96 @@
     </w:p>
     <w:p>
       <w:pPr>
-        <w:pStyle w:val="ListNumber"/>
+        <w:spacing w:after="60"/>
+        <w:ind w:left="403" w:hanging="288"/>
         <w:widowControl w:val="1"/>
       </w:pPr>
+      <w:r>
+        <w:rPr>
+          <w:b/>
+        </w:rPr>
+        <w:t xml:space="preserve">1. </w:t>
+      </w:r>
       <w:r>
         <w:t>Open the flow you want the Assistant to understand.</w:t>
       </w:r>
     </w:p>
     <w:p>
       <w:pPr>
-        <w:pStyle w:val="ListNumber"/>
+        <w:spacing w:after="60"/>
+        <w:ind w:left="403" w:hanging="288"/>
         <w:widowControl w:val="1"/>
       </w:pPr>
+      <w:r>
+        <w:rPr>
+          <w:b/>
+        </w:rPr>
+        <w:t xml:space="preserve">2. </w:t>
+      </w:r>
       <w:r>
         <w:t>Select the Langflow icon in the canvas toolbar.</w:t>
       </w:r>
     </w:p>
     <w:p>
       <w:pPr>
-        <w:pStyle w:val="ListNumber"/>
+        <w:spacing w:after="60"/>
+        <w:ind w:left="403" w:hanging="288"/>
         <w:widowControl w:val="1"/>
       </w:pPr>
+      <w:r>
+        <w:rPr>
+          <w:b/>
+        </w:rPr>
+        <w:t xml:space="preserve">3. </w:t>
+      </w:r>
       <w:r>
         <w:t>Describe the goal, inputs, outputs, provider constraints, and expected error handling.</w:t>
       </w:r>
     </w:p>
     <w:p>
       <w:pPr>
-        <w:pStyle w:val="ListNumber"/>
+        <w:spacing w:after="60"/>
+        <w:ind w:left="403" w:hanging="288"/>
         <w:widowControl w:val="1"/>
       </w:pPr>
+      <w:r>
+        <w:rPr>
+          <w:b/>
+        </w:rPr>
+        <w:t xml:space="preserve">4. </w:t>
+      </w:r>
       <w:r>
         <w:t>Review the proposed component code or flow diagram.</w:t>
       </w:r>
     </w:p>
     <w:p>
       <w:pPr>
-        <w:pStyle w:val="ListNumber"/>
+        <w:spacing w:after="60"/>
+        <w:ind w:left="403" w:hanging="288"/>
         <w:widowControl w:val="1"/>
       </w:pPr>
+      <w:r>
+        <w:rPr>
+          <w:b/>
+        </w:rPr>
+        <w:t xml:space="preserve">5. </w:t>
+      </w:r>
       <w:r>
         <w:t>Approve Add to Canvas or Replace canvas only after checking the proposal.</w:t>
       </w:r>
     </w:p>
     <w:p>
       <w:pPr>
-        <w:pStyle w:val="ListNumber"/>
+        <w:spacing w:after="60"/>
+        <w:ind w:left="403" w:hanging="288"/>
         <w:widowControl w:val="1"/>
       </w:pPr>
+      <w:r>
+        <w:rPr>
+          <w:b/>
+        </w:rPr>
+        <w:t xml:space="preserve">6. </w:t>
+      </w:r>
       <w:r>
         <w:t>Run a small test and ask for a focused correction if it fails.</w:t>
       </w:r>
@@ -2801,6 +3110,7 @@
       <w:tr>
         <w:trPr>
           <w:tblHeader w:val="true"/>
+          <w:cantSplit w:val="true"/>
         </w:trPr>
         <w:tc>
           <w:tcPr>
@@ -2879,6 +3189,9 @@
         </w:tc>
       </w:tr>
       <w:tr>
+        <w:trPr>
+          <w:cantSplit w:val="true"/>
+        </w:trPr>
         <w:tc>
           <w:tcPr>
             <w:tcW w:type="dxa" w:w="1944"/>
@@ -2941,6 +3254,9 @@
         </w:tc>
       </w:tr>
       <w:tr>
+        <w:trPr>
+          <w:cantSplit w:val="true"/>
+        </w:trPr>
         <w:tc>
           <w:tcPr>
             <w:tcW w:type="dxa" w:w="1944"/>
@@ -3062,6 +3378,7 @@
       <w:tr>
         <w:trPr>
           <w:tblHeader w:val="true"/>
+          <w:cantSplit w:val="true"/>
         </w:trPr>
         <w:tc>
           <w:tcPr>
@@ -3115,6 +3432,9 @@
         </w:tc>
       </w:tr>
       <w:tr>
+        <w:trPr>
+          <w:cantSplit w:val="true"/>
+        </w:trPr>
         <w:tc>
           <w:tcPr>
             <w:tcW w:type="dxa" w:w="2232"/>
@@ -3157,6 +3477,9 @@
         </w:tc>
       </w:tr>
       <w:tr>
+        <w:trPr>
+          <w:cantSplit w:val="true"/>
+        </w:trPr>
         <w:tc>
           <w:tcPr>
             <w:tcW w:type="dxa" w:w="2232"/>
@@ -3201,6 +3524,9 @@
         </w:tc>
       </w:tr>
       <w:tr>
+        <w:trPr>
+          <w:cantSplit w:val="true"/>
+        </w:trPr>
         <w:tc>
           <w:tcPr>
             <w:tcW w:type="dxa" w:w="2232"/>
@@ -3243,6 +3569,9 @@
         </w:tc>
       </w:tr>
       <w:tr>
+        <w:trPr>
+          <w:cantSplit w:val="true"/>
+        </w:trPr>
         <w:tc>
           <w:tcPr>
             <w:tcW w:type="dxa" w:w="2232"/>
@@ -3287,6 +3616,9 @@
         </w:tc>
       </w:tr>
       <w:tr>
+        <w:trPr>
+          <w:cantSplit w:val="true"/>
+        </w:trPr>
         <w:tc>
           <w:tcPr>
             <w:tcW w:type="dxa" w:w="2232"/>
@@ -3355,6 +3687,14 @@
     </w:p>
     <w:p>
       <w:pPr>
+        <w:widowControl w:val="1"/>
+      </w:pPr>
+      <w:r>
+        <w:br w:type="page"/>
+      </w:r>
+    </w:p>
+    <w:p>
+      <w:pPr>
         <w:pStyle w:val="Heading1"/>
         <w:keepNext/>
         <w:widowControl w:val="1"/>
@@ -3386,6 +3726,7 @@
       <w:tr>
         <w:trPr>
           <w:tblHeader w:val="true"/>
+          <w:cantSplit w:val="true"/>
         </w:trPr>
         <w:tc>
           <w:tcPr>
@@ -3464,6 +3805,9 @@
         </w:tc>
       </w:tr>
       <w:tr>
+        <w:trPr>
+          <w:cantSplit w:val="true"/>
+        </w:trPr>
         <w:tc>
           <w:tcPr>
             <w:tcW w:type="dxa" w:w="1584"/>
@@ -3526,6 +3870,9 @@
         </w:tc>
       </w:tr>
       <w:tr>
+        <w:trPr>
+          <w:cantSplit w:val="true"/>
+        </w:trPr>
         <w:tc>
           <w:tcPr>
             <w:tcW w:type="dxa" w:w="1584"/>
@@ -3591,6 +3938,9 @@
         </w:tc>
       </w:tr>
       <w:tr>
+        <w:trPr>
+          <w:cantSplit w:val="true"/>
+        </w:trPr>
         <w:tc>
           <w:tcPr>
             <w:tcW w:type="dxa" w:w="1584"/>
@@ -3653,6 +4003,9 @@
         </w:tc>
       </w:tr>
       <w:tr>
+        <w:trPr>
+          <w:cantSplit w:val="true"/>
+        </w:trPr>
         <w:tc>
           <w:tcPr>
             <w:tcW w:type="dxa" w:w="1584"/>
@@ -3718,6 +4071,9 @@
         </w:tc>
       </w:tr>
       <w:tr>
+        <w:trPr>
+          <w:cantSplit w:val="true"/>
+        </w:trPr>
         <w:tc>
           <w:tcPr>
             <w:tcW w:type="dxa" w:w="1584"/>
@@ -3852,45 +4208,80 @@
     </w:p>
     <w:p>
       <w:pPr>
-        <w:pStyle w:val="ListNumber"/>
+        <w:spacing w:after="60"/>
+        <w:ind w:left="403" w:hanging="288"/>
         <w:widowControl w:val="1"/>
       </w:pPr>
+      <w:r>
+        <w:rPr>
+          <w:b/>
+        </w:rPr>
+        <w:t xml:space="preserve">1. </w:t>
+      </w:r>
       <w:r>
         <w:t>Create a Langflow API key using your organization's approved process.</w:t>
       </w:r>
     </w:p>
     <w:p>
       <w:pPr>
-        <w:pStyle w:val="ListNumber"/>
+        <w:spacing w:after="60"/>
+        <w:ind w:left="403" w:hanging="288"/>
         <w:widowControl w:val="1"/>
       </w:pPr>
+      <w:r>
+        <w:rPr>
+          <w:b/>
+        </w:rPr>
+        <w:t xml:space="preserve">2. </w:t>
+      </w:r>
       <w:r>
         <w:t>Open the tested flow and inspect the API information in Share.</w:t>
       </w:r>
     </w:p>
     <w:p>
       <w:pPr>
-        <w:pStyle w:val="ListNumber"/>
+        <w:spacing w:after="60"/>
+        <w:ind w:left="403" w:hanging="288"/>
         <w:widowControl w:val="1"/>
       </w:pPr>
+      <w:r>
+        <w:rPr>
+          <w:b/>
+        </w:rPr>
+        <w:t xml:space="preserve">3. </w:t>
+      </w:r>
       <w:r>
         <w:t>Call the endpoint from a development environment with a small input.</w:t>
       </w:r>
     </w:p>
     <w:p>
       <w:pPr>
-        <w:pStyle w:val="ListNumber"/>
+        <w:spacing w:after="60"/>
+        <w:ind w:left="403" w:hanging="288"/>
         <w:widowControl w:val="1"/>
       </w:pPr>
+      <w:r>
+        <w:rPr>
+          <w:b/>
+        </w:rPr>
+        <w:t xml:space="preserve">4. </w:t>
+      </w:r>
       <w:r>
         <w:t>Handle authentication errors, timeouts, and invalid responses in the client.</w:t>
       </w:r>
     </w:p>
     <w:p>
       <w:pPr>
-        <w:pStyle w:val="ListNumber"/>
+        <w:spacing w:after="60"/>
+        <w:ind w:left="403" w:hanging="288"/>
         <w:widowControl w:val="1"/>
       </w:pPr>
+      <w:r>
+        <w:rPr>
+          <w:b/>
+        </w:rPr>
+        <w:t xml:space="preserve">5. </w:t>
+      </w:r>
       <w:r>
         <w:t>Record the flow version or exported JSON used by the application.</w:t>
       </w:r>
@@ -3949,63 +4340,112 @@
     </w:p>
     <w:p>
       <w:pPr>
-        <w:pStyle w:val="ListNumber"/>
+        <w:spacing w:after="60"/>
+        <w:ind w:left="403" w:hanging="288"/>
         <w:widowControl w:val="1"/>
       </w:pPr>
+      <w:r>
+        <w:rPr>
+          <w:b/>
+        </w:rPr>
+        <w:t xml:space="preserve">1. </w:t>
+      </w:r>
       <w:r>
         <w:t>Import the JSON file into a Langflow project.</w:t>
       </w:r>
     </w:p>
     <w:p>
       <w:pPr>
-        <w:pStyle w:val="ListNumber"/>
+        <w:spacing w:after="60"/>
+        <w:ind w:left="403" w:hanging="288"/>
         <w:widowControl w:val="1"/>
       </w:pPr>
+      <w:r>
+        <w:rPr>
+          <w:b/>
+        </w:rPr>
+        <w:t xml:space="preserve">2. </w:t>
+      </w:r>
       <w:r>
         <w:t>Open the Synthetic ITSM Dataset Generator component.</w:t>
       </w:r>
     </w:p>
     <w:p>
       <w:pPr>
-        <w:pStyle w:val="ListNumber"/>
+        <w:spacing w:after="60"/>
+        <w:ind w:left="403" w:hanging="288"/>
         <w:widowControl w:val="1"/>
       </w:pPr>
+      <w:r>
+        <w:rPr>
+          <w:b/>
+        </w:rPr>
+        <w:t xml:space="preserve">3. </w:t>
+      </w:r>
       <w:r>
         <w:t>Choose Incident, Change Request, or Service Request.</w:t>
       </w:r>
     </w:p>
     <w:p>
       <w:pPr>
-        <w:pStyle w:val="ListNumber"/>
+        <w:spacing w:after="60"/>
+        <w:ind w:left="403" w:hanging="288"/>
         <w:widowControl w:val="1"/>
       </w:pPr>
+      <w:r>
+        <w:rPr>
+          <w:b/>
+        </w:rPr>
+        <w:t xml:space="preserve">4. </w:t>
+      </w:r>
       <w:r>
         <w:t>Keep Dry Run enabled and run once. Inspect Generation Summary and Prompt Preview.</w:t>
       </w:r>
     </w:p>
     <w:p>
       <w:pPr>
-        <w:pStyle w:val="ListNumber"/>
+        <w:spacing w:after="60"/>
+        <w:ind w:left="403" w:hanging="288"/>
         <w:widowControl w:val="1"/>
       </w:pPr>
+      <w:r>
+        <w:rPr>
+          <w:b/>
+        </w:rPr>
+        <w:t xml:space="preserve">5. </w:t>
+      </w:r>
       <w:r>
         <w:t>Enter the OpenAI-compatible base URL, API key, and model if they are not supplied by the server environment.</w:t>
       </w:r>
     </w:p>
     <w:p>
       <w:pPr>
-        <w:pStyle w:val="ListNumber"/>
+        <w:spacing w:after="60"/>
+        <w:ind w:left="403" w:hanging="288"/>
         <w:widowControl w:val="1"/>
       </w:pPr>
+      <w:r>
+        <w:rPr>
+          <w:b/>
+        </w:rPr>
+        <w:t xml:space="preserve">6. </w:t>
+      </w:r>
       <w:r>
         <w:t>Disable Dry Run, request a small record count, and run the component.</w:t>
       </w:r>
     </w:p>
     <w:p>
       <w:pPr>
-        <w:pStyle w:val="ListNumber"/>
+        <w:spacing w:after="60"/>
+        <w:ind w:left="403" w:hanging="288"/>
         <w:widowControl w:val="1"/>
       </w:pPr>
+      <w:r>
+        <w:rPr>
+          <w:b/>
+        </w:rPr>
+        <w:t xml:space="preserve">7. </w:t>
+      </w:r>
       <w:r>
         <w:t>Use Dataset DataFrame for tabular processing or Dataset JSON for another flow or agent.</w:t>
       </w:r>
@@ -4039,54 +4479,96 @@
     </w:p>
     <w:p>
       <w:pPr>
-        <w:pStyle w:val="ListNumber"/>
+        <w:spacing w:after="60"/>
+        <w:ind w:left="403" w:hanging="288"/>
         <w:widowControl w:val="1"/>
       </w:pPr>
+      <w:r>
+        <w:rPr>
+          <w:b/>
+        </w:rPr>
+        <w:t xml:space="preserve">1. </w:t>
+      </w:r>
       <w:r>
         <w:t>Import the JSON file and inspect its five connected components.</w:t>
       </w:r>
     </w:p>
     <w:p>
       <w:pPr>
-        <w:pStyle w:val="ListNumber"/>
+        <w:spacing w:after="60"/>
+        <w:ind w:left="403" w:hanging="288"/>
         <w:widowControl w:val="1"/>
       </w:pPr>
+      <w:r>
+        <w:rPr>
+          <w:b/>
+        </w:rPr>
+        <w:t xml:space="preserve">2. </w:t>
+      </w:r>
       <w:r>
         <w:t>Configure the same OpenAI-compatible endpoint, key, and model in both LLM-powered components.</w:t>
       </w:r>
     </w:p>
     <w:p>
       <w:pPr>
-        <w:pStyle w:val="ListNumber"/>
+        <w:spacing w:after="60"/>
+        <w:ind w:left="403" w:hanging="288"/>
         <w:widowControl w:val="1"/>
       </w:pPr>
+      <w:r>
+        <w:rPr>
+          <w:b/>
+        </w:rPr>
+        <w:t xml:space="preserve">3. </w:t>
+      </w:r>
       <w:r>
         <w:t>Run both LLM-powered components in Dry Run mode and inspect their prompt previews.</w:t>
       </w:r>
     </w:p>
     <w:p>
       <w:pPr>
-        <w:pStyle w:val="ListNumber"/>
+        <w:spacing w:after="60"/>
+        <w:ind w:left="403" w:hanging="288"/>
         <w:widowControl w:val="1"/>
       </w:pPr>
+      <w:r>
+        <w:rPr>
+          <w:b/>
+        </w:rPr>
+        <w:t xml:space="preserve">4. </w:t>
+      </w:r>
       <w:r>
         <w:t>Disable Dry Run only after the prompts and settings look correct.</w:t>
       </w:r>
     </w:p>
     <w:p>
       <w:pPr>
-        <w:pStyle w:val="ListNumber"/>
+        <w:spacing w:after="60"/>
+        <w:ind w:left="403" w:hanging="288"/>
         <w:widowControl w:val="1"/>
       </w:pPr>
+      <w:r>
+        <w:rPr>
+          <w:b/>
+        </w:rPr>
+        <w:t xml:space="preserve">5. </w:t>
+      </w:r>
       <w:r>
         <w:t>Use a small holdout sample for the first complete test.</w:t>
       </w:r>
     </w:p>
     <w:p>
       <w:pPr>
-        <w:pStyle w:val="ListNumber"/>
+        <w:spacing w:after="60"/>
+        <w:ind w:left="403" w:hanging="288"/>
         <w:widowControl w:val="1"/>
       </w:pPr>
+      <w:r>
+        <w:rPr>
+          <w:b/>
+        </w:rPr>
+        <w:t xml:space="preserve">6. </w:t>
+      </w:r>
       <w:r>
         <w:t>Review overall accuracy, field performance, scenario results, routing confusion, and failed tickets in the dashboard outputs.</w:t>
       </w:r>
@@ -4123,6 +4605,7 @@
       <w:tr>
         <w:trPr>
           <w:tblHeader w:val="true"/>
+          <w:cantSplit w:val="true"/>
         </w:trPr>
         <w:tc>
           <w:tcPr>
@@ -4176,6 +4659,9 @@
         </w:tc>
       </w:tr>
       <w:tr>
+        <w:trPr>
+          <w:cantSplit w:val="true"/>
+        </w:trPr>
         <w:tc>
           <w:tcPr>
             <w:tcW w:type="dxa" w:w="4392"/>
@@ -4218,6 +4704,9 @@
         </w:tc>
       </w:tr>
       <w:tr>
+        <w:trPr>
+          <w:cantSplit w:val="true"/>
+        </w:trPr>
         <w:tc>
           <w:tcPr>
             <w:tcW w:type="dxa" w:w="4392"/>
@@ -4262,6 +4751,9 @@
         </w:tc>
       </w:tr>
       <w:tr>
+        <w:trPr>
+          <w:cantSplit w:val="true"/>
+        </w:trPr>
         <w:tc>
           <w:tcPr>
             <w:tcW w:type="dxa" w:w="4392"/>
@@ -4304,6 +4796,9 @@
         </w:tc>
       </w:tr>
       <w:tr>
+        <w:trPr>
+          <w:cantSplit w:val="true"/>
+        </w:trPr>
         <w:tc>
           <w:tcPr>
             <w:tcW w:type="dxa" w:w="4392"/>
@@ -4348,6 +4843,9 @@
         </w:tc>
       </w:tr>
       <w:tr>
+        <w:trPr>
+          <w:cantSplit w:val="true"/>
+        </w:trPr>
         <w:tc>
           <w:tcPr>
             <w:tcW w:type="dxa" w:w="4392"/>
@@ -4390,6 +4888,9 @@
         </w:tc>
       </w:tr>
       <w:tr>
+        <w:trPr>
+          <w:cantSplit w:val="true"/>
+        </w:trPr>
         <w:tc>
           <w:tcPr>
             <w:tcW w:type="dxa" w:w="4392"/>
@@ -4434,6 +4935,9 @@
         </w:tc>
       </w:tr>
       <w:tr>
+        <w:trPr>
+          <w:cantSplit w:val="true"/>
+        </w:trPr>
         <w:tc>
           <w:tcPr>
             <w:tcW w:type="dxa" w:w="4392"/>
@@ -4515,6 +5019,7 @@
       <w:tr>
         <w:trPr>
           <w:tblHeader w:val="true"/>
+          <w:cantSplit w:val="true"/>
         </w:trPr>
         <w:tc>
           <w:tcPr>
@@ -4593,6 +5098,9 @@
         </w:tc>
       </w:tr>
       <w:tr>
+        <w:trPr>
+          <w:cantSplit w:val="true"/>
+        </w:trPr>
         <w:tc>
           <w:tcPr>
             <w:tcW w:type="dxa" w:w="2520"/>
@@ -4655,6 +5163,9 @@
         </w:tc>
       </w:tr>
       <w:tr>
+        <w:trPr>
+          <w:cantSplit w:val="true"/>
+        </w:trPr>
         <w:tc>
           <w:tcPr>
             <w:tcW w:type="dxa" w:w="2520"/>
@@ -4720,6 +5231,9 @@
         </w:tc>
       </w:tr>
       <w:tr>
+        <w:trPr>
+          <w:cantSplit w:val="true"/>
+        </w:trPr>
         <w:tc>
           <w:tcPr>
             <w:tcW w:type="dxa" w:w="2520"/>
@@ -4782,6 +5296,9 @@
         </w:tc>
       </w:tr>
       <w:tr>
+        <w:trPr>
+          <w:cantSplit w:val="true"/>
+        </w:trPr>
         <w:tc>
           <w:tcPr>
             <w:tcW w:type="dxa" w:w="2520"/>
@@ -4847,6 +5364,9 @@
         </w:tc>
       </w:tr>
       <w:tr>
+        <w:trPr>
+          <w:cantSplit w:val="true"/>
+        </w:trPr>
         <w:tc>
           <w:tcPr>
             <w:tcW w:type="dxa" w:w="2520"/>
@@ -4909,6 +5429,9 @@
         </w:tc>
       </w:tr>
       <w:tr>
+        <w:trPr>
+          <w:cantSplit w:val="true"/>
+        </w:trPr>
         <w:tc>
           <w:tcPr>
             <w:tcW w:type="dxa" w:w="2520"/>
@@ -4974,6 +5497,9 @@
         </w:tc>
       </w:tr>
       <w:tr>
+        <w:trPr>
+          <w:cantSplit w:val="true"/>
+        </w:trPr>
         <w:tc>
           <w:tcPr>
             <w:tcW w:type="dxa" w:w="2520"/>
@@ -5036,6 +5562,9 @@
         </w:tc>
       </w:tr>
       <w:tr>
+        <w:trPr>
+          <w:cantSplit w:val="true"/>
+        </w:trPr>
         <w:tc>
           <w:tcPr>
             <w:tcW w:type="dxa" w:w="2520"/>
@@ -5101,6 +5630,9 @@
         </w:tc>
       </w:tr>
       <w:tr>
+        <w:trPr>
+          <w:cantSplit w:val="true"/>
+        </w:trPr>
         <w:tc>
           <w:tcPr>
             <w:tcW w:type="dxa" w:w="2520"/>
@@ -5181,54 +5713,96 @@
     </w:p>
     <w:p>
       <w:pPr>
-        <w:pStyle w:val="ListNumber"/>
+        <w:spacing w:after="60"/>
+        <w:ind w:left="403" w:hanging="288"/>
         <w:widowControl w:val="1"/>
       </w:pPr>
+      <w:r>
+        <w:rPr>
+          <w:b/>
+        </w:rPr>
+        <w:t xml:space="preserve">1. </w:t>
+      </w:r>
       <w:r>
         <w:t>Save or duplicate the current flow.</w:t>
       </w:r>
     </w:p>
     <w:p>
       <w:pPr>
-        <w:pStyle w:val="ListNumber"/>
+        <w:spacing w:after="60"/>
+        <w:ind w:left="403" w:hanging="288"/>
         <w:widowControl w:val="1"/>
       </w:pPr>
+      <w:r>
+        <w:rPr>
+          <w:b/>
+        </w:rPr>
+        <w:t xml:space="preserve">2. </w:t>
+      </w:r>
       <w:r>
         <w:t>Reproduce the failure with the smallest input.</w:t>
       </w:r>
     </w:p>
     <w:p>
       <w:pPr>
-        <w:pStyle w:val="ListNumber"/>
+        <w:spacing w:after="60"/>
+        <w:ind w:left="403" w:hanging="288"/>
         <w:widowControl w:val="1"/>
       </w:pPr>
+      <w:r>
+        <w:rPr>
+          <w:b/>
+        </w:rPr>
+        <w:t xml:space="preserve">3. </w:t>
+      </w:r>
       <w:r>
         <w:t>Find the first failed or empty component.</w:t>
       </w:r>
     </w:p>
     <w:p>
       <w:pPr>
-        <w:pStyle w:val="ListNumber"/>
+        <w:spacing w:after="60"/>
+        <w:ind w:left="403" w:hanging="288"/>
         <w:widowControl w:val="1"/>
       </w:pPr>
+      <w:r>
+        <w:rPr>
+          <w:b/>
+        </w:rPr>
+        <w:t xml:space="preserve">4. </w:t>
+      </w:r>
       <w:r>
         <w:t>Check its input values, types, credentials, and logs.</w:t>
       </w:r>
     </w:p>
     <w:p>
       <w:pPr>
-        <w:pStyle w:val="ListNumber"/>
+        <w:spacing w:after="60"/>
+        <w:ind w:left="403" w:hanging="288"/>
         <w:widowControl w:val="1"/>
       </w:pPr>
+      <w:r>
+        <w:rPr>
+          <w:b/>
+        </w:rPr>
+        <w:t xml:space="preserve">5. </w:t>
+      </w:r>
       <w:r>
         <w:t>Change one setting and run again.</w:t>
       </w:r>
     </w:p>
     <w:p>
       <w:pPr>
-        <w:pStyle w:val="ListNumber"/>
+        <w:spacing w:after="60"/>
+        <w:ind w:left="403" w:hanging="288"/>
         <w:widowControl w:val="1"/>
       </w:pPr>
+      <w:r>
+        <w:rPr>
+          <w:b/>
+        </w:rPr>
+        <w:t xml:space="preserve">6. </w:t>
+      </w:r>
       <w:r>
         <w:t>Record the working configuration and export the corrected flow.</w:t>
       </w:r>
@@ -5357,6 +5931,7 @@
       <w:tr>
         <w:trPr>
           <w:tblHeader w:val="true"/>
+          <w:cantSplit w:val="true"/>
         </w:trPr>
         <w:tc>
           <w:tcPr>
@@ -5410,6 +5985,9 @@
         </w:tc>
       </w:tr>
       <w:tr>
+        <w:trPr>
+          <w:cantSplit w:val="true"/>
+        </w:trPr>
         <w:tc>
           <w:tcPr>
             <w:tcW w:type="dxa" w:w="2160"/>
@@ -5452,6 +6030,9 @@
         </w:tc>
       </w:tr>
       <w:tr>
+        <w:trPr>
+          <w:cantSplit w:val="true"/>
+        </w:trPr>
         <w:tc>
           <w:tcPr>
             <w:tcW w:type="dxa" w:w="2160"/>
@@ -5496,6 +6077,9 @@
         </w:tc>
       </w:tr>
       <w:tr>
+        <w:trPr>
+          <w:cantSplit w:val="true"/>
+        </w:trPr>
         <w:tc>
           <w:tcPr>
             <w:tcW w:type="dxa" w:w="2160"/>
@@ -5538,6 +6122,9 @@
         </w:tc>
       </w:tr>
       <w:tr>
+        <w:trPr>
+          <w:cantSplit w:val="true"/>
+        </w:trPr>
         <w:tc>
           <w:tcPr>
             <w:tcW w:type="dxa" w:w="2160"/>
@@ -5582,6 +6169,9 @@
         </w:tc>
       </w:tr>
       <w:tr>
+        <w:trPr>
+          <w:cantSplit w:val="true"/>
+        </w:trPr>
         <w:tc>
           <w:tcPr>
             <w:tcW w:type="dxa" w:w="2160"/>
@@ -5624,6 +6214,9 @@
         </w:tc>
       </w:tr>
       <w:tr>
+        <w:trPr>
+          <w:cantSplit w:val="true"/>
+        </w:trPr>
         <w:tc>
           <w:tcPr>
             <w:tcW w:type="dxa" w:w="2160"/>
@@ -5668,6 +6261,9 @@
         </w:tc>
       </w:tr>
       <w:tr>
+        <w:trPr>
+          <w:cantSplit w:val="true"/>
+        </w:trPr>
         <w:tc>
           <w:tcPr>
             <w:tcW w:type="dxa" w:w="2160"/>
@@ -5710,6 +6306,9 @@
         </w:tc>
       </w:tr>
       <w:tr>
+        <w:trPr>
+          <w:cantSplit w:val="true"/>
+        </w:trPr>
         <w:tc>
           <w:tcPr>
             <w:tcW w:type="dxa" w:w="2160"/>
@@ -5754,6 +6353,9 @@
         </w:tc>
       </w:tr>
       <w:tr>
+        <w:trPr>
+          <w:cantSplit w:val="true"/>
+        </w:trPr>
         <w:tc>
           <w:tcPr>
             <w:tcW w:type="dxa" w:w="2160"/>
@@ -5796,6 +6398,9 @@
         </w:tc>
       </w:tr>
       <w:tr>
+        <w:trPr>
+          <w:cantSplit w:val="true"/>
+        </w:trPr>
         <w:tc>
           <w:tcPr>
             <w:tcW w:type="dxa" w:w="2160"/>
@@ -5840,6 +6445,9 @@
         </w:tc>
       </w:tr>
       <w:tr>
+        <w:trPr>
+          <w:cantSplit w:val="true"/>
+        </w:trPr>
         <w:tc>
           <w:tcPr>
             <w:tcW w:type="dxa" w:w="2160"/>
@@ -5877,6 +6485,390 @@
             </w:pPr>
             <w:r>
               <w:t>A system that stores embeddings for similarity search</w:t>
+            </w:r>
+          </w:p>
+        </w:tc>
+      </w:tr>
+    </w:tbl>
+    <w:p>
+      <w:pPr>
+        <w:spacing w:after="0"/>
+        <w:widowControl w:val="1"/>
+      </w:pPr>
+    </w:p>
+    <w:p>
+      <w:pPr>
+        <w:pStyle w:val="Heading2"/>
+        <w:keepNext/>
+        <w:widowControl w:val="1"/>
+      </w:pPr>
+      <w:r>
+        <w:t>Practice exercises</w:t>
+      </w:r>
+    </w:p>
+    <w:tbl>
+      <w:tblPr>
+        <w:tblW w:type="auto" w:w="0"/>
+        <w:jc w:val="center"/>
+        <w:tblLayout w:type="fixed"/>
+        <w:tblLook w:firstColumn="1" w:firstRow="1" w:lastColumn="0" w:lastRow="0" w:noHBand="0" w:noVBand="1" w:val="04A0"/>
+        <w:tblBorders>
+          <w:top w:val="single" w:sz="6" w:space="0" w:color="D9D9D9"/>
+          <w:left w:val="single" w:sz="6" w:space="0" w:color="D9D9D9"/>
+          <w:bottom w:val="single" w:sz="6" w:space="0" w:color="D9D9D9"/>
+          <w:right w:val="single" w:sz="6" w:space="0" w:color="D9D9D9"/>
+          <w:insideH w:val="single" w:sz="6" w:space="0" w:color="D9D9D9"/>
+          <w:insideV w:val="single" w:sz="6" w:space="0" w:color="D9D9D9"/>
+        </w:tblBorders>
+      </w:tblPr>
+      <w:tblGrid>
+        <w:gridCol w:w="3312"/>
+        <w:gridCol w:w="3312"/>
+        <w:gridCol w:w="3312"/>
+      </w:tblGrid>
+      <w:tr>
+        <w:trPr>
+          <w:tblHeader w:val="true"/>
+          <w:cantSplit w:val="true"/>
+        </w:trPr>
+        <w:tc>
+          <w:tcPr>
+            <w:tcW w:type="dxa" w:w="1440"/>
+            <w:shd w:fill="17365D"/>
+            <w:tcMar>
+              <w:top w:w="100" w:type="dxa"/>
+              <w:start w:w="120" w:type="dxa"/>
+              <w:bottom w:w="100" w:type="dxa"/>
+              <w:end w:w="120" w:type="dxa"/>
+            </w:tcMar>
+            <w:vAlign w:val="center"/>
+          </w:tcPr>
+          <w:p>
+            <w:pPr>
+              <w:jc w:val="left"/>
+            </w:pPr>
+            <w:r>
+              <w:rPr>
+                <w:b/>
+                <w:color w:val="FFFFFF"/>
+              </w:rPr>
+              <w:t>Exercise</w:t>
+            </w:r>
+          </w:p>
+        </w:tc>
+        <w:tc>
+          <w:tcPr>
+            <w:tcW w:type="dxa" w:w="4680"/>
+            <w:shd w:fill="17365D"/>
+            <w:tcMar>
+              <w:top w:w="100" w:type="dxa"/>
+              <w:start w:w="120" w:type="dxa"/>
+              <w:bottom w:w="100" w:type="dxa"/>
+              <w:end w:w="120" w:type="dxa"/>
+            </w:tcMar>
+            <w:vAlign w:val="center"/>
+          </w:tcPr>
+          <w:p>
+            <w:pPr>
+              <w:jc w:val="left"/>
+            </w:pPr>
+            <w:r>
+              <w:rPr>
+                <w:b/>
+                <w:color w:val="FFFFFF"/>
+              </w:rPr>
+              <w:t>Task</w:t>
+            </w:r>
+          </w:p>
+        </w:tc>
+        <w:tc>
+          <w:tcPr>
+            <w:tcW w:type="dxa" w:w="3672"/>
+            <w:shd w:fill="17365D"/>
+            <w:tcMar>
+              <w:top w:w="100" w:type="dxa"/>
+              <w:start w:w="120" w:type="dxa"/>
+              <w:bottom w:w="100" w:type="dxa"/>
+              <w:end w:w="120" w:type="dxa"/>
+            </w:tcMar>
+            <w:vAlign w:val="center"/>
+          </w:tcPr>
+          <w:p>
+            <w:pPr>
+              <w:jc w:val="left"/>
+            </w:pPr>
+            <w:r>
+              <w:rPr>
+                <w:b/>
+                <w:color w:val="FFFFFF"/>
+              </w:rPr>
+              <w:t>Successful result</w:t>
+            </w:r>
+          </w:p>
+        </w:tc>
+      </w:tr>
+      <w:tr>
+        <w:trPr>
+          <w:cantSplit w:val="true"/>
+        </w:trPr>
+        <w:tc>
+          <w:tcPr>
+            <w:tcW w:type="dxa" w:w="1440"/>
+            <w:tcMar>
+              <w:top w:w="100" w:type="dxa"/>
+              <w:start w:w="120" w:type="dxa"/>
+              <w:bottom w:w="100" w:type="dxa"/>
+              <w:end w:w="120" w:type="dxa"/>
+            </w:tcMar>
+            <w:vAlign w:val="center"/>
+          </w:tcPr>
+          <w:p>
+            <w:pPr>
+              <w:jc w:val="left"/>
+            </w:pPr>
+            <w:r>
+              <w:t>Import</w:t>
+            </w:r>
+          </w:p>
+        </w:tc>
+        <w:tc>
+          <w:tcPr>
+            <w:tcW w:type="dxa" w:w="4680"/>
+            <w:tcMar>
+              <w:top w:w="100" w:type="dxa"/>
+              <w:start w:w="120" w:type="dxa"/>
+              <w:bottom w:w="100" w:type="dxa"/>
+              <w:end w:w="120" w:type="dxa"/>
+            </w:tcMar>
+            <w:vAlign w:val="center"/>
+          </w:tcPr>
+          <w:p>
+            <w:pPr>
+              <w:jc w:val="left"/>
+            </w:pPr>
+            <w:r>
+              <w:t>Import the dataset generator and run it with Dry Run enabled</w:t>
+            </w:r>
+          </w:p>
+        </w:tc>
+        <w:tc>
+          <w:tcPr>
+            <w:tcW w:type="dxa" w:w="3672"/>
+            <w:tcMar>
+              <w:top w:w="100" w:type="dxa"/>
+              <w:start w:w="120" w:type="dxa"/>
+              <w:bottom w:w="100" w:type="dxa"/>
+              <w:end w:w="120" w:type="dxa"/>
+            </w:tcMar>
+            <w:vAlign w:val="center"/>
+          </w:tcPr>
+          <w:p>
+            <w:pPr>
+              <w:jc w:val="left"/>
+            </w:pPr>
+            <w:r>
+              <w:t>You can read the prompt preview without making an LLM request</w:t>
+            </w:r>
+          </w:p>
+        </w:tc>
+      </w:tr>
+      <w:tr>
+        <w:trPr>
+          <w:cantSplit w:val="true"/>
+        </w:trPr>
+        <w:tc>
+          <w:tcPr>
+            <w:tcW w:type="dxa" w:w="1440"/>
+            <w:shd w:fill="F5F7F9"/>
+            <w:tcMar>
+              <w:top w:w="100" w:type="dxa"/>
+              <w:start w:w="120" w:type="dxa"/>
+              <w:bottom w:w="100" w:type="dxa"/>
+              <w:end w:w="120" w:type="dxa"/>
+            </w:tcMar>
+            <w:vAlign w:val="center"/>
+          </w:tcPr>
+          <w:p>
+            <w:pPr>
+              <w:jc w:val="left"/>
+            </w:pPr>
+            <w:r>
+              <w:t>Edit</w:t>
+            </w:r>
+          </w:p>
+        </w:tc>
+        <w:tc>
+          <w:tcPr>
+            <w:tcW w:type="dxa" w:w="4680"/>
+            <w:shd w:fill="F5F7F9"/>
+            <w:tcMar>
+              <w:top w:w="100" w:type="dxa"/>
+              <w:start w:w="120" w:type="dxa"/>
+              <w:bottom w:w="100" w:type="dxa"/>
+              <w:end w:w="120" w:type="dxa"/>
+            </w:tcMar>
+            <w:vAlign w:val="center"/>
+          </w:tcPr>
+          <w:p>
+            <w:pPr>
+              <w:jc w:val="left"/>
+            </w:pPr>
+            <w:r>
+              <w:t>Change one safe setting, such as record type or record count</w:t>
+            </w:r>
+          </w:p>
+        </w:tc>
+        <w:tc>
+          <w:tcPr>
+            <w:tcW w:type="dxa" w:w="3672"/>
+            <w:shd w:fill="F5F7F9"/>
+            <w:tcMar>
+              <w:top w:w="100" w:type="dxa"/>
+              <w:start w:w="120" w:type="dxa"/>
+              <w:bottom w:w="100" w:type="dxa"/>
+              <w:end w:w="120" w:type="dxa"/>
+            </w:tcMar>
+            <w:vAlign w:val="center"/>
+          </w:tcPr>
+          <w:p>
+            <w:pPr>
+              <w:jc w:val="left"/>
+            </w:pPr>
+            <w:r>
+              <w:t>The next preview reflects the new setting</w:t>
+            </w:r>
+          </w:p>
+        </w:tc>
+      </w:tr>
+      <w:tr>
+        <w:trPr>
+          <w:cantSplit w:val="true"/>
+        </w:trPr>
+        <w:tc>
+          <w:tcPr>
+            <w:tcW w:type="dxa" w:w="1440"/>
+            <w:tcMar>
+              <w:top w:w="100" w:type="dxa"/>
+              <w:start w:w="120" w:type="dxa"/>
+              <w:bottom w:w="100" w:type="dxa"/>
+              <w:end w:w="120" w:type="dxa"/>
+            </w:tcMar>
+            <w:vAlign w:val="center"/>
+          </w:tcPr>
+          <w:p>
+            <w:pPr>
+              <w:jc w:val="left"/>
+            </w:pPr>
+            <w:r>
+              <w:t>Build</w:t>
+            </w:r>
+          </w:p>
+        </w:tc>
+        <w:tc>
+          <w:tcPr>
+            <w:tcW w:type="dxa" w:w="4680"/>
+            <w:tcMar>
+              <w:top w:w="100" w:type="dxa"/>
+              <w:start w:w="120" w:type="dxa"/>
+              <w:bottom w:w="100" w:type="dxa"/>
+              <w:end w:w="120" w:type="dxa"/>
+            </w:tcMar>
+            <w:vAlign w:val="center"/>
+          </w:tcPr>
+          <w:p>
+            <w:pPr>
+              <w:jc w:val="left"/>
+            </w:pPr>
+            <w:r>
+              <w:t>Create a basic chat flow from a template or blank canvas</w:t>
+            </w:r>
+          </w:p>
+        </w:tc>
+        <w:tc>
+          <w:tcPr>
+            <w:tcW w:type="dxa" w:w="3672"/>
+            <w:tcMar>
+              <w:top w:w="100" w:type="dxa"/>
+              <w:start w:w="120" w:type="dxa"/>
+              <w:bottom w:w="100" w:type="dxa"/>
+              <w:end w:w="120" w:type="dxa"/>
+            </w:tcMar>
+            <w:vAlign w:val="center"/>
+          </w:tcPr>
+          <w:p>
+            <w:pPr>
+              <w:jc w:val="left"/>
+            </w:pPr>
+            <w:r>
+              <w:t>The Playground returns a response to a simple message</w:t>
+            </w:r>
+          </w:p>
+        </w:tc>
+      </w:tr>
+      <w:tr>
+        <w:trPr>
+          <w:cantSplit w:val="true"/>
+        </w:trPr>
+        <w:tc>
+          <w:tcPr>
+            <w:tcW w:type="dxa" w:w="1440"/>
+            <w:shd w:fill="F5F7F9"/>
+            <w:tcMar>
+              <w:top w:w="100" w:type="dxa"/>
+              <w:start w:w="120" w:type="dxa"/>
+              <w:bottom w:w="100" w:type="dxa"/>
+              <w:end w:w="120" w:type="dxa"/>
+            </w:tcMar>
+            <w:vAlign w:val="center"/>
+          </w:tcPr>
+          <w:p>
+            <w:pPr>
+              <w:jc w:val="left"/>
+            </w:pPr>
+            <w:r>
+              <w:t>Debug</w:t>
+            </w:r>
+          </w:p>
+        </w:tc>
+        <w:tc>
+          <w:tcPr>
+            <w:tcW w:type="dxa" w:w="4680"/>
+            <w:shd w:fill="F5F7F9"/>
+            <w:tcMar>
+              <w:top w:w="100" w:type="dxa"/>
+              <w:start w:w="120" w:type="dxa"/>
+              <w:bottom w:w="100" w:type="dxa"/>
+              <w:end w:w="120" w:type="dxa"/>
+            </w:tcMar>
+            <w:vAlign w:val="center"/>
+          </w:tcPr>
+          <w:p>
+            <w:pPr>
+              <w:jc w:val="left"/>
+            </w:pPr>
+            <w:r>
+              <w:t>Temporarily remove one required value and run the affected component</w:t>
+            </w:r>
+          </w:p>
+        </w:tc>
+        <w:tc>
+          <w:tcPr>
+            <w:tcW w:type="dxa" w:w="3672"/>
+            <w:shd w:fill="F5F7F9"/>
+            <w:tcMar>
+              <w:top w:w="100" w:type="dxa"/>
+              <w:start w:w="120" w:type="dxa"/>
+              <w:bottom w:w="100" w:type="dxa"/>
+              <w:end w:w="120" w:type="dxa"/>
+            </w:tcMar>
+            <w:vAlign w:val="center"/>
+          </w:tcPr>
+          <w:p>
+            <w:pPr>
+              <w:jc w:val="left"/>
+            </w:pPr>
+            <w:r>
+              <w:t>You can find the first error, restore the value, and run successfully</w:t>
             </w:r>
           </w:p>
         </w:tc>
@@ -6754,9 +7746,6 @@
     <w:rsid w:val="00FC693F"/>
     <w:pPr>
       <w:keepNext/>
-      <w:pBdr>
-        <w:bottom w:val="single" w:sz="8" w:space="4" w:color="4F81BD" w:themeColor="accent1"/>
-      </w:pBdr>
       <w:spacing w:after="240" w:line="240" w:lineRule="auto" w:before="0"/>
       <w:contextualSpacing/>
     </w:pPr>

</xml_diff>